<commit_message>
refs+figures audit: verified 12 refs via Crossref/arXiv APIs (fixed MIRAGE DOI/pages acl.37->acl.372/6233-6251, PI-RADS first author Weinreb->Turkbey); zh refs renumbered to order of first appearance 1-12 with [2][7][8][11] citations added; tables 1-2 now cited in text; fixed EN Figure 5 caption (blue/yellow, top-12 edges) and added EN Table 4 caption; zh docx now includes full figure-legend section
</commit_message>
<xml_diff>
--- a/outputs/submission/manuscript_zh.docx
+++ b/outputs/submission/manuscript_zh.docx
@@ -286,7 +286,7 @@
           <w:b w:val="0"/>
           <w:sz w:val="24"/>
         </w:rPr>
-        <w:t>新兴证据显示，大语言模型能够就前列腺穿刺活检与前列腺癌相关问题给出高质量、具备临床相关性的回答（如基于电子病历系统个性化前列腺癌患者教育的 LLM 智能体研究 [12]）。但放到患者教育这一具体任务上，通用 LLM 存在四重落差 [5-7]：知识可能失真（幻觉），结论无法回溯到指南原文（不可溯源），语言对非专业读者不够友好（可读性），输出随提问方式波动（不稳定）。这些落差无法靠提示词修补，需要架构级对策：确定性约束防止越界输出，检索使结论可回溯，生成提示控制语言层级并明确安全边界。</w:t>
+        <w:t>新兴证据显示，大语言模型能够就前列腺穿刺活检与前列腺癌相关问题给出高质量、具备临床相关性的回答（如基于电子病历系统个性化前列腺癌患者教育的 LLM 智能体研究 [2]）。但放到患者教育这一具体任务上，通用 LLM 存在四重落差 [3-5]：知识可能失真（幻觉），结论无法回溯到指南原文（不可溯源），语言对非专业读者不够友好（可读性），输出随提问方式波动（不稳定）。这些落差无法靠提示词修补，需要架构级对策：确定性约束防止越界输出，检索使结论可回溯，生成提示控制语言层级并明确安全边界。</w:t>
       </w:r>
     </w:p>
     <w:p>
@@ -300,7 +300,7 @@
           <w:b w:val="0"/>
           <w:sz w:val="24"/>
         </w:rPr>
-        <w:t>为弥合上述双重缺口，本研究基于 ProBIOPSY 国际共识（112 条最终陈述）[1] 构建了前列安汇（QianLieAnHui）决策支持智能体。系统由三层串联而成：16 条确定性规则（与 EAU、AUA/ASTRO 指南交叉核对）在机制上禁止与共识相悖的输出；LightRAG [10] 知识图谱与词法证据库构成双层检索，使每条建议都能回溯到编号证据；GLM 仲裁器在硬约束解码下输出五类可执行动作之一，并附陈述级引用。患者教育模式复用同一冻结证据基座，将患者提问与十条逐项可溯源的策展事实匹配，以通俗语言生成包含"何时须就医"安全提示的回答，并将患者引导回其主管医生。设计目标不是替代沟通，而是把重复性的解释工作从临床时间中卸载，把共同决策的时间留给真正需要权衡的决策；这对健康素养有限的患者尤为重要。</w:t>
+        <w:t>为弥合上述双重缺口，本研究基于 ProBIOPSY 国际共识（112 条最终陈述）[1] 构建了前列安汇（QianLieAnHui）决策支持智能体。系统由三层串联而成：16 条确定性规则（与 EAU、AUA/ASTRO 指南交叉核对）在机制上禁止与共识相悖的输出；LightRAG [6] 知识图谱与词法证据库构成双层检索，使每条建议都能回溯到编号证据；GLM 仲裁器在硬约束解码下输出五类可执行动作之一，并附陈述级引用。患者教育模式复用同一冻结证据基座，将患者提问与十条逐项可溯源的策展事实匹配，以通俗语言生成包含"何时须就医"安全提示的回答，并将患者引导回其主管医生。设计目标不是替代沟通，而是把重复性的解释工作从临床时间中卸载，把共同决策的时间留给真正需要权衡的决策；这对健康素养有限的患者尤为重要。</w:t>
       </w:r>
     </w:p>
     <w:p>
@@ -354,7 +354,7 @@
           <w:b w:val="0"/>
           <w:sz w:val="24"/>
         </w:rPr>
-        <w:t>2. European Association of Urology. EAU Guidelines on Prostate Cancer. Arnhem: EAU; 2026. https://uroweb.org/guidelines/prostate-cancer</w:t>
+        <w:t>2. Hao Y, Holmes J, Waddle MR, et al. Personalizing prostate cancer education for patients using an EHR-integrated LLM agent. npj Digit Med 2025;8:770. DOI: 10.1038/s41746-025-02166-0</w:t>
       </w:r>
     </w:p>
     <w:p>
@@ -367,7 +367,7 @@
           <w:b w:val="0"/>
           <w:sz w:val="24"/>
         </w:rPr>
-        <w:t>3. Weinreb JC, Barentsz JO, Choyke PL, et al. PI-RADS Prostate Imaging — Reporting and Data System: Version 2.1: 2019. Eur Urol 2019;76:340-51. DOI: 10.1016/j.eururo.2019.02.033</w:t>
+        <w:t>3. Thirunavukarasu AJ, et al. Large language models in medicine. Nat Med 2023;29:1930-40. DOI: 10.1038/s41591-023-02448-8（2026-10-12 复核）</w:t>
       </w:r>
     </w:p>
     <w:p>
@@ -380,7 +380,7 @@
           <w:b w:val="0"/>
           <w:sz w:val="24"/>
         </w:rPr>
-        <w:t>4. Sutton RT, et al. An overview of clinical decision support systems: benefits, risks, and strategies for success. NPJ Digit Med 2020;3:17. DOI: 10.1038/s41746-020-0221-y</w:t>
+        <w:t>4. Singhal K, et al. Large language models encode clinical knowledge. Nature 2023;620:172-80. DOI: 10.1038/s41586-023-06291-2（2026-10-12 复核）</w:t>
       </w:r>
     </w:p>
     <w:p>
@@ -393,7 +393,7 @@
           <w:b w:val="0"/>
           <w:sz w:val="24"/>
         </w:rPr>
-        <w:t>5. Thirunavukarasu AJ, et al. Large language models in medicine. Nat Med 2023;29:1930-40. DOI: 10.1038/s41591-023-02448-8</w:t>
+        <w:t>5. Ji Z, et al. Survey of hallucination in natural language generation. ACM Comput Surv 2023;55(12):248. DOI: 10.1145/3571730（2026-10-12 复核）</w:t>
       </w:r>
     </w:p>
     <w:p>
@@ -406,7 +406,7 @@
           <w:b w:val="0"/>
           <w:sz w:val="24"/>
         </w:rPr>
-        <w:t>6. Singhal K, et al. Large language models encode clinical knowledge. Nature 2023;620:172-80. DOI: 10.1038/s41586-023-06291-2</w:t>
+        <w:t>6. Guo Z, Xia L, Yu Y, Ao T, Huang C. LightRAG: Simple and Fast Retrieval-Augmented Generation. arXiv:2410.05779 (2024).</w:t>
       </w:r>
     </w:p>
     <w:p>
@@ -419,7 +419,7 @@
           <w:b w:val="0"/>
           <w:sz w:val="24"/>
         </w:rPr>
-        <w:t>7. Ji Z, et al. Survey of hallucination in natural language generation. ACM Comput Surv 2023;55(12):248. DOI: 10.1145/3571730</w:t>
+        <w:t>7. Turkbey B, Rosenkrantz AB, Haider MA, et al. Prostate Imaging Reporting and Data System Version 2.1: 2019 Update of Prostate Imaging Reporting and Data System Version 2. Eur Urol 2019;76:340-51. DOI: 10.1016/j.eururo.2019.02.033（2026-10-12 更正第一作者：原误作 Weinreb JC；Weinreb 为 PI-RADS v2（2016）第一作者）</w:t>
       </w:r>
     </w:p>
     <w:p>
@@ -432,7 +432,7 @@
           <w:b w:val="0"/>
           <w:sz w:val="24"/>
         </w:rPr>
-        <w:t>8. Lewis P, et al. Retrieval-augmented generation for knowledge-intensive NLP tasks. NeurIPS 2020;33:9459-74.</w:t>
+        <w:t>8. European Association of Urology. EAU Guidelines on Prostate Cancer. Arnhem: EAU; 2026. https://uroweb.org/guidelines/prostate-cancer</w:t>
       </w:r>
     </w:p>
     <w:p>
@@ -445,7 +445,7 @@
           <w:b w:val="0"/>
           <w:sz w:val="24"/>
         </w:rPr>
-        <w:t>9. Xiong G, Jin Q, Lu Z, Zhang A. Benchmarking retrieval-augmented generation for medicine (MIRAGE). Findings of ACL 2024:633-54. DOI: 10.18653/v1/2024.findings-acl.37</w:t>
+        <w:t>9. Xiong G, Jin Q, Lu Z, Zhang A. Benchmarking retrieval-augmented generation for medicine (MIRAGE). Findings of ACL 2024:6233-6251. DOI: 10.18653/v1/2024.findings-acl.372（2026-10-12 更正 DOI 与页码：原误作 2024.findings-acl.37、633-54）</w:t>
       </w:r>
     </w:p>
     <w:p>
@@ -458,7 +458,7 @@
           <w:b w:val="0"/>
           <w:sz w:val="24"/>
         </w:rPr>
-        <w:t>10. Guo Z, Xia L, Yu Y, Ao T, Huang C. LightRAG: Simple and Fast Retrieval-Augmented Generation. arXiv:2410.05779 (2024).</w:t>
+        <w:t>10. Lewis P, et al. Retrieval-augmented generation for knowledge-intensive NLP tasks. NeurIPS 2020;33:9459-74.（arXiv:2005.11401，2026-10-12 复核）</w:t>
       </w:r>
     </w:p>
     <w:p>
@@ -484,7 +484,7 @@
           <w:b w:val="0"/>
           <w:sz w:val="24"/>
         </w:rPr>
-        <w:t>12. Hao Y, Holmes J, Waddle MR, et al. Personalizing prostate cancer education for patients using an EHR-integrated LLM agent. npj Digit Med 2025;8:770. DOI: 10.1038/s41746-025-02166-0</w:t>
+        <w:t>12. Sutton RT, et al. An overview of clinical decision support systems: benefits, risks, and strategies for success. NPJ Digit Med 2020;3:17. DOI: 10.1038/s41746-020-0221-y（2026-10-12 复核）</w:t>
       </w:r>
     </w:p>
     <w:p>
@@ -743,7 +743,7 @@
           <w:b w:val="0"/>
           <w:sz w:val="24"/>
         </w:rPr>
-        <w:t>：51 个情境原型，49 个独立情境标志位（flags），覆盖影像（PI-RADS 分级、mpMRI/bpMRI、磁场强度、PI-QUAL 质量）、实验室标志物（PSA、PSA 密度）、临床与病史（既往穿刺阴性、家族史、感染危险因素、抗凝）、治疗意图与资源可得性等 7 个类别；</w:t>
+        <w:t>：51 个情境原型，49 个独立情境标志位（flags），覆盖影像（PI-RADS 分级[7]、mpMRI/bpMRI、磁场强度、PI-QUAL 质量）、实验室标志物（PSA、PSA 密度）、临床与病史（既往穿刺阴性、家族史、感染危险因素、抗凝）、治疗意图与资源可得性等 7 个类别（表 1）；</w:t>
       </w:r>
     </w:p>
     <w:p>
@@ -809,7 +809,7 @@
           <w:b w:val="0"/>
           <w:sz w:val="24"/>
         </w:rPr>
-        <w:t>）含 16 条确定性规则：12 条共识规则（consensus rules）+ 4 条患者因素升级规则（patient-factor rules）。每条规则定义触发标志位组合（Entity A flags × Entity B flags）、严重度（high/medium/low）、机制类别（影像路径、穿刺方案选择、靶向穿刺、围术期、治疗规划衔接等）与推荐动作。规则匹配完全确定性、无需 LLM 参与，匹配成功时向下游输出硬约束（hard constraints，例如必须否决某选项或必须升级某操作），并全部携带 ProBIOPSY 陈述编号（Q 编号）溯源。患者因素规则在共识规则之上做情境升级（如感染危险因素→优先经会阴入路/强化预防；不适合根治治疗→简化穿刺方案）。</w:t>
+        <w:t>）含 16 条确定性规则：12 条共识规则（consensus rules）+ 4 条患者因素升级规则（patient-factor rules）。每条规则定义触发标志位组合（Entity A flags × Entity B flags）、严重度（high/medium/low）、机制类别（影像路径、穿刺方案选择、靶向穿刺、围术期、治疗规划衔接等）与推荐动作。规则匹配完全确定性、无需 LLM 参与，匹配成功时向下游输出硬约束（hard constraints，例如必须否决某选项或必须升级某操作），并全部携带 ProBIOPSY 陈述编号（Q 编号）溯源（表 2）。全部 16 条规则均已与 EAU 前列腺癌指南[8]及 AUA/ASTRO 指南在动作层面交叉核对，分歧处以 ProBIOPSY 共识为准并记录于规则的依据字段。患者因素规则在共识规则之上做情境升级（如存在感染危险因素时优先经会阴入路或强化预防，不适合根治治疗时简化穿刺方案）。</w:t>
       </w:r>
     </w:p>
     <w:p>
@@ -3075,7 +3075,7 @@
           <w:b w:val="0"/>
           <w:sz w:val="24"/>
         </w:rPr>
-        <w:t>放在现有文献里，本研究与医学 RAG 基准（如 MIRAGE[9]）回答的是两个不同的问题：前者衡量模型知道多少，我们衡量的是系统能否把一份共识执行成可审计的临床动作。检索增强生成确实能把输出锚定到外部语料[8]，但没有任何机制去拦截一条与指南相悖而措辞流畅的推荐，两个基线滥报反对和 conditional 静默的行为恰好为这个缺陷画了像。这也解释了 LightRAG[10] 在本架构中的位置：它专注承担证据引擎，分类和约束交给规则层；与传统规则型 CDSS[4] 相比，人工审计被压缩到小而关键的规则层面，长尾知识交由图谱。</w:t>
+        <w:t>放在现有文献里，本研究与医学 RAG 基准（如 MIRAGE[9]）回答的是两个不同的问题：前者衡量模型知道多少，我们衡量的是系统能否把一份共识执行成可审计的临床动作。检索增强生成确实能把输出锚定到外部语料[10]，但没有任何机制去拦截一条与指南相悖而措辞流畅的推荐，两个基线滥报反对和 conditional 静默的行为恰好为这个缺陷画了像。这也界定了通用图检索方案（GraphRAG[11]、LightRAG[6]）在本架构中的位置：LightRAG 专注承担证据引擎，分类和约束交给规则层；与传统规则型 CDSS[12] 相比，人工审计被压缩到小而关键的规则层面，长尾知识交由图谱。</w:t>
       </w:r>
     </w:p>
     <w:p>
@@ -3117,7 +3117,7 @@
           <w:b w:val="0"/>
           <w:sz w:val="24"/>
         </w:rPr>
-        <w:t>穿刺路径的另一半在患者一侧。解释穿刺为什么必要、报告意味着什么，这类对话耗时且难以计价，在超负荷的门诊里最先被让位，而这一不对称正是教育型患者智能体的出发点（如基于电子病历的前列腺癌教育智能体[12]）。教育问答不需要五类动作的粒度，也就不必在生成层复制医生侧的硬约束，前列安汇的做法是复用同一冻结证据链，叠加十条逐项可溯源的事实库，以提示词要求通俗语言、禁止编造统计数字，并包含"什么时候必须就医"的安全网段落；内容对准的是门诊里最容易漏掉的要点，比如扩展穿刺方案下的孤立性 HGPIN 通常不需要早期重复穿刺、ASAP 后的重复穿刺因为相当比例能检出具临床意义的癌而不应推迟、良性报告绝不意味着随访终结。这个模式有意不输出动作裁决，只引用证据并把患者引回主管医生，让患者的回答也能像医生的裁决一样接受审计；目前它以三段逐字咨询完成了定性演示，可读性和效果评估还是未来工作。</w:t>
+        <w:t>穿刺路径的另一半在患者一侧。解释穿刺为什么必要、报告意味着什么，这类对话耗时且难以计价，在超负荷的门诊里最先被让位，而这一不对称正是教育型患者智能体的出发点（如基于电子病历的前列腺癌教育智能体[2]）。教育问答不需要五类动作的粒度，也就不必在生成层复制医生侧的硬约束，前列安汇的做法是复用同一冻结证据链，叠加十条逐项可溯源的事实库，以提示词要求通俗语言、禁止编造统计数字，并包含"什么时候必须就医"的安全网段落；内容对准的是门诊里最容易漏掉的要点，比如扩展穿刺方案下的孤立性 HGPIN 通常不需要早期重复穿刺、ASAP 后的重复穿刺因为相当比例能检出具临床意义的癌而不应推迟、良性报告绝不意味着随访终结。这个模式有意不输出动作裁决，只引用证据并把患者引回主管医生，让患者的回答也能像医生的裁决一样接受审计；目前它以三段逐字咨询完成了定性演示，可读性和效果评估还是未来工作。</w:t>
       </w:r>
     </w:p>
     <w:p>
@@ -3556,6 +3556,218 @@
           <w:sz w:val="24"/>
         </w:rPr>
         <w:t xml:space="preserve"> 金标准领域×动作分布（outputs/tables/table4_validation.md）</w:t>
+      </w:r>
+    </w:p>
+    <w:p>
+      <w:pPr>
+        <w:spacing w:line="360" w:lineRule="auto" w:before="240" w:after="120"/>
+        <w:outlineLvl w:val="1"/>
+      </w:pPr>
+      <w:r>
+        <w:rPr>
+          <w:rFonts w:ascii="Times New Roman" w:hAnsi="Times New Roman" w:eastAsia="黑体"/>
+          <w:b/>
+          <w:sz w:val="28"/>
+        </w:rPr>
+        <w:t>图注 (Figure legends)</w:t>
+      </w:r>
+    </w:p>
+    <w:p>
+      <w:pPr>
+        <w:spacing w:line="480" w:lineRule="auto" w:before="0" w:after="0"/>
+        <w:ind w:firstLine="480"/>
+      </w:pPr>
+      <w:r>
+        <w:rPr>
+          <w:rFonts w:ascii="Times New Roman" w:hAnsi="Times New Roman" w:eastAsia="宋体"/>
+          <w:b/>
+          <w:sz w:val="24"/>
+        </w:rPr>
+        <w:t>图 1</w:t>
+      </w:r>
+      <w:r>
+        <w:rPr>
+          <w:rFonts w:ascii="Times New Roman" w:hAnsi="Times New Roman" w:eastAsia="宋体"/>
+          <w:b w:val="0"/>
+          <w:sz w:val="24"/>
+        </w:rPr>
+        <w:t xml:space="preserve"> 系统架构与基准设计。ProBIOPSY 共识语料（112 条终版陈述、357 个证据块、LightRAG 索引 1,864 实体/3,078 关系）在构建期蒸馏为 16 条确定性规则与检索索引。运行时，患者情境×决策项查询依次经过：(1) 输出 Q 编号硬约束的确定性规则引擎（虚线箭头绑定仲裁器）；(2) LightRAG 知识图谱与词法证据库融合的风险引导检索；(3) 在硬约束解码下输出带陈述级引用的五类动作裁决的 LLM 仲裁器（GLM-5.3）。图中给出示例查询（局灶治疗计划下的限局性 PI-RADS 4 病灶）与对应的结构化输出。管线之下为第二个运行模式条带：患者教育复用同一冻结证据库，患者的通俗提问经关键词匹配到含 10 个条目、逐项可溯源的策展事实库，同一生成器产生带"何时须就医"安全网段落并引导回主管医生的通俗回答（定性演示，不属于基准评测）。底部条带：多方法多种子基准（112 条陈述 × 4 方法 × 5 种子 = 2,240 次运行，生成器固定）。</w:t>
+      </w:r>
+    </w:p>
+    <w:p>
+      <w:pPr>
+        <w:spacing w:line="480" w:lineRule="auto" w:before="0" w:after="0"/>
+        <w:ind w:firstLine="480"/>
+      </w:pPr>
+      <w:r>
+        <w:rPr>
+          <w:rFonts w:ascii="Times New Roman" w:hAnsi="Times New Roman" w:eastAsia="宋体"/>
+          <w:b/>
+          <w:sz w:val="24"/>
+        </w:rPr>
+        <w:t>图 2</w:t>
+      </w:r>
+      <w:r>
+        <w:rPr>
+          <w:rFonts w:ascii="Times New Roman" w:hAnsi="Times New Roman" w:eastAsia="宋体"/>
+          <w:b w:val="0"/>
+          <w:sz w:val="24"/>
+        </w:rPr>
+        <w:t xml:space="preserve"> 多种子基准（4 方法 × 5 种子 × 112 条陈述）。(a) 各方法核心指标（5 种子 mean±SD）：exact-5、exact-3、macro-F1、Cohen's κ 与 against 类 F1；(b) 各种子的 exact-5（点，虚线为均值）；(c) 各方法 560 次运行的预测类别分布（柱）与金标准分布（菱形）：检索基线几乎不输出 conditional，完整系统的分布最贴近金标准。</w:t>
+      </w:r>
+    </w:p>
+    <w:p>
+      <w:pPr>
+        <w:spacing w:line="480" w:lineRule="auto" w:before="0" w:after="0"/>
+        <w:ind w:firstLine="480"/>
+      </w:pPr>
+      <w:r>
+        <w:rPr>
+          <w:rFonts w:ascii="Times New Roman" w:hAnsi="Times New Roman" w:eastAsia="宋体"/>
+          <w:b/>
+          <w:sz w:val="24"/>
+        </w:rPr>
+        <w:t>图 3</w:t>
+      </w:r>
+      <w:r>
+        <w:rPr>
+          <w:rFonts w:ascii="Times New Roman" w:hAnsi="Times New Roman" w:eastAsia="宋体"/>
+          <w:b w:val="0"/>
+          <w:sz w:val="24"/>
+        </w:rPr>
+        <w:t xml:space="preserve"> 四专家对五个演示病例（组合命题）的盲评。(a) 各病例的专家间一致率（4 专家中众数评分占比；虚线 = 3/4）；Fleiss κ = −0.09（标 *）为小样本伪影，原始一致率 17/20；(b) 各病例各专家的评分（End = endorse，EndO = endorse_option，Cond = conditional，RepO = report_option，Aga = against）；System 列为系统裁决，在 4 个有多数票的病例中均与专家多数一致，case1 为 2:2 平票（按预设规则不计入）；(c) 专家对系统输出的 Likert 评分（清晰度、有用性、认可度、证据充分性；一致 5 分，触顶）。</w:t>
+      </w:r>
+    </w:p>
+    <w:p>
+      <w:pPr>
+        <w:spacing w:line="480" w:lineRule="auto" w:before="0" w:after="0"/>
+        <w:ind w:firstLine="480"/>
+      </w:pPr>
+      <w:r>
+        <w:rPr>
+          <w:rFonts w:ascii="Times New Roman" w:hAnsi="Times New Roman" w:eastAsia="宋体"/>
+          <w:b/>
+          <w:sz w:val="24"/>
+        </w:rPr>
+        <w:t>图 4</w:t>
+      </w:r>
+      <w:r>
+        <w:rPr>
+          <w:rFonts w:ascii="Times New Roman" w:hAnsi="Times New Roman" w:eastAsia="宋体"/>
+          <w:b w:val="0"/>
+          <w:sz w:val="24"/>
+        </w:rPr>
+        <w:t xml:space="preserve"> 演示病例。(a) 各病例触发的共识规则数，柱色与标注为该病例的裁决动作；(b) 证据语料构成（文献条目 C 218、共识陈述 B 112、共识叙述 20、系统综述摘要 7，共 357 块）。</w:t>
+      </w:r>
+    </w:p>
+    <w:p>
+      <w:pPr>
+        <w:spacing w:line="480" w:lineRule="auto" w:before="0" w:after="0"/>
+        <w:ind w:firstLine="480"/>
+      </w:pPr>
+      <w:r>
+        <w:rPr>
+          <w:rFonts w:ascii="Times New Roman" w:hAnsi="Times New Roman" w:eastAsia="宋体"/>
+          <w:b/>
+          <w:sz w:val="24"/>
+        </w:rPr>
+        <w:t>图 5</w:t>
+      </w:r>
+      <w:r>
+        <w:rPr>
+          <w:rFonts w:ascii="Times New Roman" w:hAnsi="Times New Roman" w:eastAsia="宋体"/>
+          <w:b w:val="0"/>
+          <w:sz w:val="24"/>
+        </w:rPr>
+        <w:t xml:space="preserve"> 运行时与知识图谱统计。(a) 各演示病例的决策通过时延（对数轴）：规则引擎层（蓝）与检索加仲裁（黄）；(b) 最强知识图谱关系：按边权重排序的前 12 条（共 3,078 条边）。</w:t>
+      </w:r>
+    </w:p>
+    <w:p>
+      <w:pPr>
+        <w:spacing w:line="480" w:lineRule="auto" w:before="0" w:after="0"/>
+        <w:ind w:firstLine="480"/>
+      </w:pPr>
+      <w:r>
+        <w:rPr>
+          <w:rFonts w:ascii="Times New Roman" w:hAnsi="Times New Roman" w:eastAsia="宋体"/>
+          <w:b/>
+          <w:sz w:val="24"/>
+        </w:rPr>
+        <w:t>表 1</w:t>
+      </w:r>
+      <w:r>
+        <w:rPr>
+          <w:rFonts w:ascii="Times New Roman" w:hAnsi="Times New Roman" w:eastAsia="宋体"/>
+          <w:b w:val="0"/>
+          <w:sz w:val="24"/>
+        </w:rPr>
+        <w:t xml:space="preserve"> 双实体注册表的条目数、标志位数与类别分布；完整注册表见 data/seed/entities_a.csv 与 entities_b.csv。</w:t>
+      </w:r>
+    </w:p>
+    <w:p>
+      <w:pPr>
+        <w:spacing w:line="480" w:lineRule="auto" w:before="0" w:after="0"/>
+        <w:ind w:firstLine="480"/>
+      </w:pPr>
+      <w:r>
+        <w:rPr>
+          <w:rFonts w:ascii="Times New Roman" w:hAnsi="Times New Roman" w:eastAsia="宋体"/>
+          <w:b/>
+          <w:sz w:val="24"/>
+        </w:rPr>
+        <w:t>表 2</w:t>
+      </w:r>
+      <w:r>
+        <w:rPr>
+          <w:rFonts w:ascii="Times New Roman" w:hAnsi="Times New Roman" w:eastAsia="宋体"/>
+          <w:b w:val="0"/>
+          <w:sz w:val="24"/>
+        </w:rPr>
+        <w:t xml:space="preserve"> 16 条规则（12 条共识规则 + 4 条患者因素升级规则）；触发定义、推荐动作与 Q 编号引用见 configs/rules.yaml。</w:t>
+      </w:r>
+    </w:p>
+    <w:p>
+      <w:pPr>
+        <w:spacing w:line="480" w:lineRule="auto" w:before="0" w:after="0"/>
+        <w:ind w:firstLine="480"/>
+      </w:pPr>
+      <w:r>
+        <w:rPr>
+          <w:rFonts w:ascii="Times New Roman" w:hAnsi="Times New Roman" w:eastAsia="宋体"/>
+          <w:b/>
+          <w:sz w:val="24"/>
+        </w:rPr>
+        <w:t>表 3</w:t>
+      </w:r>
+      <w:r>
+        <w:rPr>
+          <w:rFonts w:ascii="Times New Roman" w:hAnsi="Times New Roman" w:eastAsia="宋体"/>
+          <w:b w:val="0"/>
+          <w:sz w:val="24"/>
+        </w:rPr>
+        <w:t xml:space="preserve"> 基准性能矩阵（5 种子 mean±SD；每方法 560 次，共 2,240 次）；上下文为每次运行的平均检索字符数。</w:t>
+      </w:r>
+    </w:p>
+    <w:p>
+      <w:pPr>
+        <w:spacing w:line="480" w:lineRule="auto" w:before="0" w:after="0"/>
+        <w:ind w:firstLine="480"/>
+      </w:pPr>
+      <w:r>
+        <w:rPr>
+          <w:rFonts w:ascii="Times New Roman" w:hAnsi="Times New Roman" w:eastAsia="宋体"/>
+          <w:b/>
+          <w:sz w:val="24"/>
+        </w:rPr>
+        <w:t>表 4</w:t>
+      </w:r>
+      <w:r>
+        <w:rPr>
+          <w:rFonts w:ascii="Times New Roman" w:hAnsi="Times New Roman" w:eastAsia="宋体"/>
+          <w:b w:val="0"/>
+          <w:sz w:val="24"/>
+        </w:rPr>
+        <w:t xml:space="preserve"> 112 条终版陈述的金标准领域×动作分布（indication 23、procedure 34、treatment planning 55；against 类 25 条，合计 22.3%）。</w:t>
       </w:r>
     </w:p>
     <w:sectPr>

</xml_diff>